<commit_message>
Regenerate all deliverables in the AI Value chart; fix missing Select import
Questionnaire capture, public response and record forms crashed because
QForm and Records used Select without importing it. Document layout gains a
paper size option (A4/Letter). Training levels translated in plans.
Screenshots retaken with the CortexSkills and AI Value logos; guides,
admin guides, install guide, conformance report, checklist, decks, sample
document sets (universal, private clinics, public hospital) and PDFs rebuilt.

Co-Authored-By: Claude Opus 5.5 <noreply@anthropic.com>
Claude-Session: https://claude.ai/code/session_01CPoP9gXznxAoCuDQx1kksH
</commit_message>
<xml_diff>
--- a/cortexskills/deliverables/CortexSkills_Admin_Guide_EN.docx
+++ b/cortexskills/deliverables/CortexSkills_Admin_Guide_EN.docx
@@ -142,7 +142,7 @@
           <w:sz w:val="20"/>
           <w:szCs w:val="20"/>
         </w:rPr>
-        <w:t>Version 1.10.0 · 2026-10-06</w:t>
+        <w:t>Version 1.10.0 · 2026-10-07</w:t>
       </w:r>
     </w:p>
     <w:p>
@@ -227,7 +227,7 @@
             </w:rPr>
             <w:fldChar w:fldCharType="separate"/>
           </w:r>
-          <w:hyperlink w:anchor="__RefHeading___Toc163528_1462423236">
+          <w:hyperlink w:anchor="__RefHeading___Toc163528_2904896170">
             <w:r>
               <w:rPr>
                 <w:rStyle w:val="IndexLink"/>
@@ -247,7 +247,7 @@
             </w:tabs>
             <w:rPr/>
           </w:pPr>
-          <w:hyperlink w:anchor="__RefHeading___Toc163530_1462423236">
+          <w:hyperlink w:anchor="__RefHeading___Toc163530_2904896170">
             <w:r>
               <w:rPr>
                 <w:rStyle w:val="IndexLink"/>
@@ -267,7 +267,7 @@
             </w:tabs>
             <w:rPr/>
           </w:pPr>
-          <w:hyperlink w:anchor="__RefHeading___Toc163532_1462423236">
+          <w:hyperlink w:anchor="__RefHeading___Toc163532_2904896170">
             <w:r>
               <w:rPr>
                 <w:rStyle w:val="IndexLink"/>
@@ -287,7 +287,7 @@
             </w:tabs>
             <w:rPr/>
           </w:pPr>
-          <w:hyperlink w:anchor="__RefHeading___Toc163534_1462423236">
+          <w:hyperlink w:anchor="__RefHeading___Toc163534_2904896170">
             <w:r>
               <w:rPr>
                 <w:rStyle w:val="IndexLink"/>
@@ -307,7 +307,7 @@
             </w:tabs>
             <w:rPr/>
           </w:pPr>
-          <w:hyperlink w:anchor="__RefHeading___Toc163536_1462423236">
+          <w:hyperlink w:anchor="__RefHeading___Toc163536_2904896170">
             <w:r>
               <w:rPr>
                 <w:rStyle w:val="IndexLink"/>
@@ -327,7 +327,7 @@
             </w:tabs>
             <w:rPr/>
           </w:pPr>
-          <w:hyperlink w:anchor="__RefHeading___Toc163538_1462423236">
+          <w:hyperlink w:anchor="__RefHeading___Toc163538_2904896170">
             <w:r>
               <w:rPr>
                 <w:rStyle w:val="IndexLink"/>
@@ -347,7 +347,7 @@
             </w:tabs>
             <w:rPr/>
           </w:pPr>
-          <w:hyperlink w:anchor="__RefHeading___Toc163540_1462423236">
+          <w:hyperlink w:anchor="__RefHeading___Toc163540_2904896170">
             <w:r>
               <w:rPr>
                 <w:rStyle w:val="IndexLink"/>
@@ -367,7 +367,7 @@
             </w:tabs>
             <w:rPr/>
           </w:pPr>
-          <w:hyperlink w:anchor="__RefHeading___Toc163542_1462423236">
+          <w:hyperlink w:anchor="__RefHeading___Toc163542_2904896170">
             <w:r>
               <w:rPr>
                 <w:rStyle w:val="IndexLink"/>
@@ -387,7 +387,7 @@
             </w:tabs>
             <w:rPr/>
           </w:pPr>
-          <w:hyperlink w:anchor="__RefHeading___Toc163544_1462423236">
+          <w:hyperlink w:anchor="__RefHeading___Toc163544_2904896170">
             <w:r>
               <w:rPr>
                 <w:rStyle w:val="IndexLink"/>
@@ -407,7 +407,7 @@
             </w:tabs>
             <w:rPr/>
           </w:pPr>
-          <w:hyperlink w:anchor="__RefHeading___Toc163546_1462423236">
+          <w:hyperlink w:anchor="__RefHeading___Toc163546_2904896170">
             <w:r>
               <w:rPr>
                 <w:rStyle w:val="IndexLink"/>
@@ -427,7 +427,7 @@
             </w:tabs>
             <w:rPr/>
           </w:pPr>
-          <w:hyperlink w:anchor="__RefHeading___Toc163548_1462423236">
+          <w:hyperlink w:anchor="__RefHeading___Toc163548_2904896170">
             <w:r>
               <w:rPr>
                 <w:rStyle w:val="IndexLink"/>
@@ -471,7 +471,7 @@
         <w:spacing w:before="0" w:after="200"/>
         <w:rPr/>
       </w:pPr>
-      <w:bookmarkStart w:id="0" w:name="__RefHeading___Toc163528_1462423236"/>
+      <w:bookmarkStart w:id="0" w:name="__RefHeading___Toc163528_2904896170"/>
       <w:bookmarkEnd w:id="0"/>
       <w:r>
         <w:rPr>
@@ -1086,7 +1086,7 @@
       <w:r>
         <w:br w:type="page"/>
       </w:r>
-      <w:bookmarkStart w:id="1" w:name="__RefHeading___Toc163530_1462423236"/>
+      <w:bookmarkStart w:id="1" w:name="__RefHeading___Toc163530_2904896170"/>
       <w:bookmarkEnd w:id="1"/>
       <w:r>
         <w:rPr>
@@ -1682,7 +1682,7 @@
         <w:spacing w:before="0" w:after="200"/>
         <w:rPr/>
       </w:pPr>
-      <w:bookmarkStart w:id="2" w:name="__RefHeading___Toc163532_1462423236"/>
+      <w:bookmarkStart w:id="2" w:name="__RefHeading___Toc163532_2904896170"/>
       <w:bookmarkEnd w:id="2"/>
       <w:r>
         <w:rPr>
@@ -2095,7 +2095,7 @@
         <w:spacing w:before="0" w:after="200"/>
         <w:rPr/>
       </w:pPr>
-      <w:bookmarkStart w:id="3" w:name="__RefHeading___Toc163534_1462423236"/>
+      <w:bookmarkStart w:id="3" w:name="__RefHeading___Toc163534_2904896170"/>
       <w:bookmarkEnd w:id="3"/>
       <w:r>
         <w:rPr>
@@ -2699,7 +2699,7 @@
         <w:spacing w:before="0" w:after="200"/>
         <w:rPr/>
       </w:pPr>
-      <w:bookmarkStart w:id="4" w:name="__RefHeading___Toc163536_1462423236"/>
+      <w:bookmarkStart w:id="4" w:name="__RefHeading___Toc163536_2904896170"/>
       <w:bookmarkEnd w:id="4"/>
       <w:r>
         <w:rPr>
@@ -3120,7 +3120,7 @@
         <w:spacing w:before="0" w:after="200"/>
         <w:rPr/>
       </w:pPr>
-      <w:bookmarkStart w:id="5" w:name="__RefHeading___Toc163538_1462423236"/>
+      <w:bookmarkStart w:id="5" w:name="__RefHeading___Toc163538_2904896170"/>
       <w:bookmarkEnd w:id="5"/>
       <w:r>
         <w:rPr>
@@ -3434,7 +3434,7 @@
         <w:spacing w:before="0" w:after="200"/>
         <w:rPr/>
       </w:pPr>
-      <w:bookmarkStart w:id="6" w:name="__RefHeading___Toc163540_1462423236"/>
+      <w:bookmarkStart w:id="6" w:name="__RefHeading___Toc163540_2904896170"/>
       <w:bookmarkEnd w:id="6"/>
       <w:r>
         <w:rPr>
@@ -3915,7 +3915,7 @@
         <w:spacing w:before="0" w:after="200"/>
         <w:rPr/>
       </w:pPr>
-      <w:bookmarkStart w:id="7" w:name="__RefHeading___Toc163542_1462423236"/>
+      <w:bookmarkStart w:id="7" w:name="__RefHeading___Toc163542_2904896170"/>
       <w:bookmarkEnd w:id="7"/>
       <w:r>
         <w:rPr>
@@ -4157,7 +4157,7 @@
           <w:sz w:val="21"/>
           <w:szCs w:val="21"/>
         </w:rPr>
-        <w:t>Body font — Times New Roman 12 pt; Heading — 17 pt; Alignment — Justified; Table header color — F8931D</w:t>
+        <w:t>Body font — Open Sans 11 pt; Heading font — Montserrat 16 pt; Alignment — Left; Table header color — 123A5F (Navy); Paper — A4; Margins — 20 mm</w:t>
       </w:r>
     </w:p>
     <w:p>
@@ -4393,7 +4393,7 @@
         <w:spacing w:before="0" w:after="200"/>
         <w:rPr/>
       </w:pPr>
-      <w:bookmarkStart w:id="8" w:name="__RefHeading___Toc163544_1462423236"/>
+      <w:bookmarkStart w:id="8" w:name="__RefHeading___Toc163544_2904896170"/>
       <w:bookmarkEnd w:id="8"/>
       <w:r>
         <w:rPr>
@@ -4642,7 +4642,7 @@
         <w:spacing w:before="0" w:after="200"/>
         <w:rPr/>
       </w:pPr>
-      <w:bookmarkStart w:id="9" w:name="__RefHeading___Toc163546_1462423236"/>
+      <w:bookmarkStart w:id="9" w:name="__RefHeading___Toc163546_2904896170"/>
       <w:bookmarkEnd w:id="9"/>
       <w:r>
         <w:rPr>
@@ -5285,7 +5285,7 @@
         <w:spacing w:before="280" w:after="120"/>
         <w:rPr/>
       </w:pPr>
-      <w:bookmarkStart w:id="10" w:name="__RefHeading___Toc163548_1462423236"/>
+      <w:bookmarkStart w:id="10" w:name="__RefHeading___Toc163548_2904896170"/>
       <w:bookmarkEnd w:id="10"/>
       <w:r>
         <w:rPr>

</xml_diff>